<commit_message>
Cloud data preparation: prepare datasets on Cloud Run while the GPU benchmarks, chosen automatically
Where a dataset is prepared is no longer a user choice: on the GPU server
when it is free; while it runs or queues a job, on the cloud preparation
service (cloudprep/, Google Cloud Run) via the control plane's new
/api/prep/jobs API; without that service, in the browser as before. The
service runs the same preparation bundle as the server and the browser,
so prepared flows and their hash are identical. Jobs are signed by the
control plane and use single-use Storage URLs only.

Co-Authored-By: Claude Opus 5.5 <noreply@anthropic.com>
Claude-Session: https://claude.ai/code/session_01THqB2neCikVAawL45RNVrt
</commit_message>
<xml_diff>
--- a/docs/thesis/testing/1 - AgentMeter Modules.docx
+++ b/docs/thesis/testing/1 - AgentMeter Modules.docx
@@ -723,7 +723,7 @@
                 <w:i w:val="0"/>
                 <w:sz w:val="24"/>
               </w:rPr>
-              <w:t>Browser Preparation Engine</w:t>
+              <w:t>Cloud &amp; Browser Preparation Engine</w:t>
             </w:r>
           </w:p>
         </w:tc>
@@ -742,7 +742,7 @@
                 <w:i w:val="0"/>
                 <w:sz w:val="24"/>
               </w:rPr>
-              <w:t>Runs the same Python preparation code in the user’s web browser using Pyodide in a Web Worker, so datasets can be prepared on the user’s computer while the GPU server is busy benchmarking.</w:t>
+              <w:t>Chooses automatically where a dataset is prepared: on the GPU server when it is free, and on a cloud preparation service (Google Cloud Run) while the GPU is busy benchmarking, so new data never waits in the GPU queue. Without the cloud service, the same Python code runs in the user’s web browser using Pyodide.</w:t>
             </w:r>
           </w:p>
         </w:tc>

</xml_diff>

<commit_message>
Thesis: functionality tests trimmed to the essential 45
Co-Authored-By: Claude Opus 5.5 <noreply@anthropic.com>
Claude-Session: https://claude.ai/code/session_01THqB2neCikVAawL45RNVrt
</commit_message>
<xml_diff>
--- a/docs/thesis/testing/1 - AgentMeter Modules.docx
+++ b/docs/thesis/testing/1 - AgentMeter Modules.docx
@@ -723,7 +723,7 @@
                 <w:i w:val="0"/>
                 <w:sz w:val="24"/>
               </w:rPr>
-              <w:t>Cloud &amp; Browser Preparation Engine</w:t>
+              <w:t>Browser Preparation Engine</w:t>
             </w:r>
           </w:p>
         </w:tc>
@@ -742,7 +742,7 @@
                 <w:i w:val="0"/>
                 <w:sz w:val="24"/>
               </w:rPr>
-              <w:t>Chooses automatically where a dataset is prepared: on the GPU server when it is free, and on a cloud preparation service (Google Cloud Run) while the GPU is busy benchmarking, so new data never waits in the GPU queue. Without the cloud service, the same Python code runs in the user’s web browser using Pyodide.</w:t>
+              <w:t>Runs the same Python preparation code in the user’s web browser using Pyodide in a Web Worker, so datasets can be prepared on the user’s computer while the GPU server is busy benchmarking.</w:t>
             </w:r>
           </w:p>
         </w:tc>

</xml_diff>